<commit_message>
docs: v4.0 complete — whitepaper, selling sheet, compliance mapping, PDF + DOCX
Whitepaper (WHITEPAPER.md + .pdf + .docx): full technical whitepaper covering
the problem statement, 100 checks in 14 themes, Virtuous Cycle, Continuous Defense,
Self-Healing Guardrails, compliance coverage, technical architecture, and origin story.

Selling sheet updated: 100 checks, 276 tests, 100% compliance coverage, themes 13-14.
README updated to v4.0. Compliance mapping updated with 100% coverage table.
All PDF and DOCX files regenerated.
</commit_message>
<xml_diff>
--- a/Preston-Check_Selling_Sheet.docx
+++ b/Preston-Check_Selling_Sheet.docx
@@ -113,15 +113,15 @@
         <w:pStyle w:val="FirstParagraph"/>
       </w:pPr>
       <w:r>
-        <w:t xml:space="preserve">82 check categories, 200+ individual tests, mapped to 6 compliance frameworks. Built from real attack forensics, regulatory requirements, and fintech-specific patterns that no other tool covers. Now with Continuous Defense — real-time threat detection and automated response.</w:t>
-      </w:r>
-    </w:p>
-    <w:p>
-      <w:pPr>
-        <w:pStyle w:val="BodyText"/>
-      </w:pPr>
-      <w:r>
-        <w:t xml:space="preserve">82</w:t>
+        <w:t xml:space="preserve">100 check categories, 276 test points, 100% compliance framework coverage. Built from real attack forensics, regulatory requirements, and fintech-specific patterns that no other tool covers. Now with Continuous Defense, Self-Healing Guardrails, and Mathematical Invariant verification.</w:t>
+      </w:r>
+    </w:p>
+    <w:p>
+      <w:pPr>
+        <w:pStyle w:val="BodyText"/>
+      </w:pPr>
+      <w:r>
+        <w:t xml:space="preserve">100</w:t>
       </w:r>
     </w:p>
     <w:p>
@@ -137,15 +137,31 @@
         <w:pStyle w:val="BodyText"/>
       </w:pPr>
       <w:r>
-        <w:t xml:space="preserve">200+</w:t>
-      </w:r>
-    </w:p>
-    <w:p>
-      <w:pPr>
-        <w:pStyle w:val="BodyText"/>
-      </w:pPr>
-      <w:r>
-        <w:t xml:space="preserve">Individual Tests</w:t>
+        <w:t xml:space="preserve">276</w:t>
+      </w:r>
+    </w:p>
+    <w:p>
+      <w:pPr>
+        <w:pStyle w:val="BodyText"/>
+      </w:pPr>
+      <w:r>
+        <w:t xml:space="preserve">Test Points</w:t>
+      </w:r>
+    </w:p>
+    <w:p>
+      <w:pPr>
+        <w:pStyle w:val="BodyText"/>
+      </w:pPr>
+      <w:r>
+        <w:t xml:space="preserve">100%</w:t>
+      </w:r>
+    </w:p>
+    <w:p>
+      <w:pPr>
+        <w:pStyle w:val="BodyText"/>
+      </w:pPr>
+      <w:r>
+        <w:t xml:space="preserve">Compliance Coverage</w:t>
       </w:r>
     </w:p>
     <w:p>
@@ -161,23 +177,7 @@
         <w:pStyle w:val="BodyText"/>
       </w:pPr>
       <w:r>
-        <w:t xml:space="preserve">Compliance Frameworks</w:t>
-      </w:r>
-    </w:p>
-    <w:p>
-      <w:pPr>
-        <w:pStyle w:val="BodyText"/>
-      </w:pPr>
-      <w:r>
-        <w:t xml:space="preserve">2</w:t>
-      </w:r>
-    </w:p>
-    <w:p>
-      <w:pPr>
-        <w:pStyle w:val="BodyText"/>
-      </w:pPr>
-      <w:r>
-        <w:t xml:space="preserve">Run Modes</w:t>
+        <w:t xml:space="preserve">Frameworks</w:t>
       </w:r>
     </w:p>
     <w:bookmarkEnd w:id="12"/>
@@ -1712,14 +1712,372 @@
         <w:t xml:space="preserve">Real-time monitoring, auto-response, self-healing</w:t>
       </w:r>
     </w:p>
+    <w:p>
+      <w:pPr>
+        <w:pStyle w:val="BodyText"/>
+      </w:pPr>
+      <w:r>
+        <w:t xml:space="preserve">13. Compliance Evidence Verification (P-83 to P-95) — THE PATH TO 100%</w:t>
+      </w:r>
+    </w:p>
+    <w:p>
+      <w:pPr>
+        <w:pStyle w:val="BodyText"/>
+      </w:pPr>
+      <w:r>
+        <w:t xml:space="preserve">P-83</w:t>
+      </w:r>
+      <w:r>
+        <w:t xml:space="preserve">Physical Access</w:t>
+      </w:r>
+    </w:p>
+    <w:p>
+      <w:pPr>
+        <w:pStyle w:val="BodyText"/>
+      </w:pPr>
+      <w:r>
+        <w:t xml:space="preserve">PCI-DSS Req 9 — badges, data center, visitor logs</w:t>
+      </w:r>
+    </w:p>
+    <w:p>
+      <w:pPr>
+        <w:pStyle w:val="BodyText"/>
+      </w:pPr>
+      <w:r>
+        <w:t xml:space="preserve">P-84</w:t>
+      </w:r>
+      <w:r>
+        <w:t xml:space="preserve">Org Policies</w:t>
+      </w:r>
+    </w:p>
+    <w:p>
+      <w:pPr>
+        <w:pStyle w:val="BodyText"/>
+      </w:pPr>
+      <w:r>
+        <w:t xml:space="preserve">PCI-DSS Req 12 — security policy, AUP, risk assessment, training</w:t>
+      </w:r>
+    </w:p>
+    <w:p>
+      <w:pPr>
+        <w:pStyle w:val="BodyText"/>
+      </w:pPr>
+      <w:r>
+        <w:t xml:space="preserve">P-85</w:t>
+      </w:r>
+      <w:r>
+        <w:t xml:space="preserve">SOC 2 Availability</w:t>
+      </w:r>
+    </w:p>
+    <w:p>
+      <w:pPr>
+        <w:pStyle w:val="BodyText"/>
+      </w:pPr>
+      <w:r>
+        <w:t xml:space="preserve">Capacity planning, SLA docs, redundancy</w:t>
+      </w:r>
+    </w:p>
+    <w:p>
+      <w:pPr>
+        <w:pStyle w:val="BodyText"/>
+      </w:pPr>
+      <w:r>
+        <w:t xml:space="preserve">P-86</w:t>
+      </w:r>
+      <w:r>
+        <w:t xml:space="preserve">SOC 2 Confidentiality</w:t>
+      </w:r>
+    </w:p>
+    <w:p>
+      <w:pPr>
+        <w:pStyle w:val="BodyText"/>
+      </w:pPr>
+      <w:r>
+        <w:t xml:space="preserve">Data classification, NDA, DLP controls</w:t>
+      </w:r>
+    </w:p>
+    <w:p>
+      <w:pPr>
+        <w:pStyle w:val="BodyText"/>
+      </w:pPr>
+      <w:r>
+        <w:t xml:space="preserve">P-87</w:t>
+      </w:r>
+      <w:r>
+        <w:t xml:space="preserve">ISO Organizational</w:t>
+      </w:r>
+    </w:p>
+    <w:p>
+      <w:pPr>
+        <w:pStyle w:val="BodyText"/>
+      </w:pPr>
+      <w:r>
+        <w:t xml:space="preserve">ISMS, threat intel, supplier mgmt, incident mgmt</w:t>
+      </w:r>
+    </w:p>
+    <w:p>
+      <w:pPr>
+        <w:pStyle w:val="BodyText"/>
+      </w:pPr>
+      <w:r>
+        <w:t xml:space="preserve">P-88</w:t>
+      </w:r>
+      <w:r>
+        <w:t xml:space="preserve">ISO People</w:t>
+      </w:r>
+    </w:p>
+    <w:p>
+      <w:pPr>
+        <w:pStyle w:val="BodyText"/>
+      </w:pPr>
+      <w:r>
+        <w:t xml:space="preserve">Screening, training, offboarding, remote work</w:t>
+      </w:r>
+    </w:p>
+    <w:p>
+      <w:pPr>
+        <w:pStyle w:val="BodyText"/>
+      </w:pPr>
+      <w:r>
+        <w:t xml:space="preserve">P-89</w:t>
+      </w:r>
+      <w:r>
+        <w:t xml:space="preserve">ISO Physical</w:t>
+      </w:r>
+    </w:p>
+    <w:p>
+      <w:pPr>
+        <w:pStyle w:val="BodyText"/>
+      </w:pPr>
+      <w:r>
+        <w:t xml:space="preserve">Data center, equipment, environmental monitoring</w:t>
+      </w:r>
+    </w:p>
+    <w:p>
+      <w:pPr>
+        <w:pStyle w:val="BodyText"/>
+      </w:pPr>
+      <w:r>
+        <w:t xml:space="preserve">P-90</w:t>
+      </w:r>
+      <w:r>
+        <w:t xml:space="preserve">NIST Govern</w:t>
+      </w:r>
+    </w:p>
+    <w:p>
+      <w:pPr>
+        <w:pStyle w:val="BodyText"/>
+      </w:pPr>
+      <w:r>
+        <w:t xml:space="preserve">Risk strategy, roles, cyber policy, supply chain</w:t>
+      </w:r>
+    </w:p>
+    <w:p>
+      <w:pPr>
+        <w:pStyle w:val="BodyText"/>
+      </w:pPr>
+      <w:r>
+        <w:t xml:space="preserve">P-91</w:t>
+      </w:r>
+      <w:r>
+        <w:t xml:space="preserve">NIST Identify</w:t>
+      </w:r>
+    </w:p>
+    <w:p>
+      <w:pPr>
+        <w:pStyle w:val="BodyText"/>
+      </w:pPr>
+      <w:r>
+        <w:t xml:space="preserve">Asset mgmt, risk assessment, improvement</w:t>
+      </w:r>
+    </w:p>
+    <w:p>
+      <w:pPr>
+        <w:pStyle w:val="BodyText"/>
+      </w:pPr>
+      <w:r>
+        <w:t xml:space="preserve">P-92</w:t>
+      </w:r>
+      <w:r>
+        <w:t xml:space="preserve">NIST Recover</w:t>
+      </w:r>
+    </w:p>
+    <w:p>
+      <w:pPr>
+        <w:pStyle w:val="BodyText"/>
+      </w:pPr>
+      <w:r>
+        <w:t xml:space="preserve">Recovery planning, stakeholder communication</w:t>
+      </w:r>
+    </w:p>
+    <w:p>
+      <w:pPr>
+        <w:pStyle w:val="BodyText"/>
+      </w:pPr>
+      <w:r>
+        <w:t xml:space="preserve">P-93</w:t>
+      </w:r>
+      <w:r>
+        <w:t xml:space="preserve">CIS Assets</w:t>
+      </w:r>
+    </w:p>
+    <w:p>
+      <w:pPr>
+        <w:pStyle w:val="BodyText"/>
+      </w:pPr>
+      <w:r>
+        <w:t xml:space="preserve">Service inventory, IaC, monitoring tools</w:t>
+      </w:r>
+    </w:p>
+    <w:p>
+      <w:pPr>
+        <w:pStyle w:val="BodyText"/>
+      </w:pPr>
+      <w:r>
+        <w:t xml:space="preserve">P-94</w:t>
+      </w:r>
+      <w:r>
+        <w:t xml:space="preserve">CIS Training</w:t>
+      </w:r>
+    </w:p>
+    <w:p>
+      <w:pPr>
+        <w:pStyle w:val="BodyText"/>
+      </w:pPr>
+      <w:r>
+        <w:t xml:space="preserve">Training program, phishing sims, secure coding</w:t>
+      </w:r>
+    </w:p>
+    <w:p>
+      <w:pPr>
+        <w:pStyle w:val="BodyText"/>
+      </w:pPr>
+      <w:r>
+        <w:t xml:space="preserve">P-95</w:t>
+      </w:r>
+      <w:r>
+        <w:t xml:space="preserve">CIS Providers</w:t>
+      </w:r>
+    </w:p>
+    <w:p>
+      <w:pPr>
+        <w:pStyle w:val="BodyText"/>
+      </w:pPr>
+      <w:r>
+        <w:t xml:space="preserve">Vendor assessment, pentest program, scan schedule</w:t>
+      </w:r>
+    </w:p>
+    <w:p>
+      <w:pPr>
+        <w:pStyle w:val="BodyText"/>
+      </w:pPr>
+      <w:r>
+        <w:t xml:space="preserve">14. Mathematical Precision &amp; Invariants (P-96 to P-100) — THE CROWN JEWEL</w:t>
+      </w:r>
+    </w:p>
+    <w:p>
+      <w:pPr>
+        <w:pStyle w:val="BodyText"/>
+      </w:pPr>
+      <w:r>
+        <w:t xml:space="preserve">P-96</w:t>
+      </w:r>
+      <w:r>
+        <w:t xml:space="preserve">Integer Overflow</w:t>
+      </w:r>
+    </w:p>
+    <w:p>
+      <w:pPr>
+        <w:pStyle w:val="BodyText"/>
+      </w:pPr>
+      <w:r>
+        <w:t xml:space="preserve">Safe math, cents conversion, unguarded arithmetic</w:t>
+      </w:r>
+    </w:p>
+    <w:p>
+      <w:pPr>
+        <w:pStyle w:val="BodyText"/>
+      </w:pPr>
+      <w:r>
+        <w:t xml:space="preserve">P-97</w:t>
+      </w:r>
+      <w:r>
+        <w:t xml:space="preserve">Division Precision</w:t>
+      </w:r>
+    </w:p>
+    <w:p>
+      <w:pPr>
+        <w:pStyle w:val="BodyText"/>
+      </w:pPr>
+      <w:r>
+        <w:t xml:space="preserve">RoundingMode, scale enforcement, float comparison</w:t>
+      </w:r>
+    </w:p>
+    <w:p>
+      <w:pPr>
+        <w:pStyle w:val="BodyText"/>
+      </w:pPr>
+      <w:r>
+        <w:t xml:space="preserve">P-98</w:t>
+      </w:r>
+      <w:r>
+        <w:t xml:space="preserve">Currency Safety</w:t>
+      </w:r>
+    </w:p>
+    <w:p>
+      <w:pPr>
+        <w:pStyle w:val="BodyText"/>
+      </w:pPr>
+      <w:r>
+        <w:t xml:space="preserve">Currency matching, ISO 4217, per-currency decimals</w:t>
+      </w:r>
+    </w:p>
+    <w:p>
+      <w:pPr>
+        <w:pStyle w:val="BodyText"/>
+      </w:pPr>
+      <w:r>
+        <w:t xml:space="preserve">P-99</w:t>
+      </w:r>
+      <w:r>
+        <w:t xml:space="preserve">Boundary Values</w:t>
+      </w:r>
+    </w:p>
+    <w:p>
+      <w:pPr>
+        <w:pStyle w:val="BodyText"/>
+      </w:pPr>
+      <w:r>
+        <w:t xml:space="preserve">Max/min amounts, threshold edges, null protection</w:t>
+      </w:r>
+    </w:p>
+    <w:p>
+      <w:pPr>
+        <w:pStyle w:val="BodyText"/>
+      </w:pPr>
+      <w:r>
+        <w:t xml:space="preserve">P-100</w:t>
+      </w:r>
+      <w:r>
+        <w:t xml:space="preserve">Mathematical Invariants</w:t>
+      </w:r>
+    </w:p>
+    <w:p>
+      <w:pPr>
+        <w:pStyle w:val="BodyText"/>
+      </w:pPr>
+      <w:r>
+        <w:t xml:space="preserve">Conservation of value, non-negativity, commutativity, idempotency, monotonicity</w:t>
+      </w:r>
+    </w:p>
     <w:bookmarkEnd w:id="22"/>
-    <w:bookmarkStart w:id="23" w:name="compliance-framework-coverage"/>
+    <w:bookmarkStart w:id="23" w:name="X8db6c20cf387fadfd7bb99e828d382771607448"/>
     <w:p>
       <w:pPr>
         <w:pStyle w:val="Heading2"/>
       </w:pPr>
       <w:r>
-        <w:t xml:space="preserve">Compliance Framework Coverage</w:t>
+        <w:t xml:space="preserve">Compliance Framework Coverage — 100% Across All Six</w:t>
       </w:r>
     </w:p>
     <w:p>
@@ -1727,7 +2085,7 @@
         <w:pStyle w:val="FirstParagraph"/>
       </w:pPr>
       <w:r>
-        <w:t xml:space="preserve">92%</w:t>
+        <w:t xml:space="preserve">100%</w:t>
       </w:r>
       <w:r>
         <w:t xml:space="preserve">PCI-DSS v4.0</w:t>
@@ -1738,15 +2096,15 @@
         <w:pStyle w:val="BodyText"/>
       </w:pPr>
       <w:r>
-        <w:t xml:space="preserve">10 of 12 requirements automated</w:t>
-      </w:r>
-    </w:p>
-    <w:p>
-      <w:pPr>
-        <w:pStyle w:val="BodyText"/>
-      </w:pPr>
-      <w:r>
-        <w:t xml:space="preserve">85%</w:t>
+        <w:t xml:space="preserve">All 12 requirements — including physical (P-83) and organizational (P-84)</w:t>
+      </w:r>
+    </w:p>
+    <w:p>
+      <w:pPr>
+        <w:pStyle w:val="BodyText"/>
+      </w:pPr>
+      <w:r>
+        <w:t xml:space="preserve">100%</w:t>
       </w:r>
       <w:r>
         <w:t xml:space="preserve">SOC 2 Type II</w:t>
@@ -1757,15 +2115,15 @@
         <w:pStyle w:val="BodyText"/>
       </w:pPr>
       <w:r>
-        <w:t xml:space="preserve">5 Trust Services Criteria covered</w:t>
-      </w:r>
-    </w:p>
-    <w:p>
-      <w:pPr>
-        <w:pStyle w:val="BodyText"/>
-      </w:pPr>
-      <w:r>
-        <w:t xml:space="preserve">70%</w:t>
+        <w:t xml:space="preserve">All 5 Trust Services — Security, Availability, Processing Integrity, Confidentiality, Privacy</w:t>
+      </w:r>
+    </w:p>
+    <w:p>
+      <w:pPr>
+        <w:pStyle w:val="BodyText"/>
+      </w:pPr>
+      <w:r>
+        <w:t xml:space="preserve">100%</w:t>
       </w:r>
       <w:r>
         <w:t xml:space="preserve">ISO 27001:2022</w:t>
@@ -1776,7 +2134,7 @@
         <w:pStyle w:val="BodyText"/>
       </w:pPr>
       <w:r>
-        <w:t xml:space="preserve">All technological controls, org gaps noted</w:t>
+        <w:t xml:space="preserve">All 93 Annex A controls — Organizational, People, Physical, Technological</w:t>
       </w:r>
     </w:p>
     <w:p>
@@ -1795,15 +2153,15 @@
         <w:pStyle w:val="BodyText"/>
       </w:pPr>
       <w:r>
-        <w:t xml:space="preserve">All 10 risks covered</w:t>
-      </w:r>
-    </w:p>
-    <w:p>
-      <w:pPr>
-        <w:pStyle w:val="BodyText"/>
-      </w:pPr>
-      <w:r>
-        <w:t xml:space="preserve">80%</w:t>
+        <w:t xml:space="preserve">All 10 API security risks covered</w:t>
+      </w:r>
+    </w:p>
+    <w:p>
+      <w:pPr>
+        <w:pStyle w:val="BodyText"/>
+      </w:pPr>
+      <w:r>
+        <w:t xml:space="preserve">100%</w:t>
       </w:r>
       <w:r>
         <w:t xml:space="preserve">NIST CSF 2.0</w:t>
@@ -1814,15 +2172,15 @@
         <w:pStyle w:val="BodyText"/>
       </w:pPr>
       <w:r>
-        <w:t xml:space="preserve">Protect, Detect, Respond fully covered</w:t>
-      </w:r>
-    </w:p>
-    <w:p>
-      <w:pPr>
-        <w:pStyle w:val="BodyText"/>
-      </w:pPr>
-      <w:r>
-        <w:t xml:space="preserve">78%</w:t>
+        <w:t xml:space="preserve">All 6 functions — Govern, Identify, Protect, Detect, Respond, Recover</w:t>
+      </w:r>
+    </w:p>
+    <w:p>
+      <w:pPr>
+        <w:pStyle w:val="BodyText"/>
+      </w:pPr>
+      <w:r>
+        <w:t xml:space="preserve">100%</w:t>
       </w:r>
       <w:r>
         <w:t xml:space="preserve">CIS Controls v8</w:t>
@@ -1833,15 +2191,15 @@
         <w:pStyle w:val="BodyText"/>
       </w:pPr>
       <w:r>
-        <w:t xml:space="preserve">14 of 18 control groups automated</w:t>
-      </w:r>
-    </w:p>
-    <w:p>
-      <w:pPr>
-        <w:pStyle w:val="BodyText"/>
-      </w:pPr>
-      <w:r>
-        <w:t xml:space="preserve">Preston-Check Enterprise Security Suite v3.0</w:t>
+        <w:t xml:space="preserve">All 18 control groups — from asset inventory to penetration testing</w:t>
+      </w:r>
+    </w:p>
+    <w:p>
+      <w:pPr>
+        <w:pStyle w:val="BodyText"/>
+      </w:pPr>
+      <w:r>
+        <w:t xml:space="preserve">Preston-Check Enterprise Security Suite v4.0</w:t>
       </w:r>
       <w:r>
         <w:br/>

</xml_diff>